<commit_message>
feat: createur de templates sur le site avec variables {{...}} + remplissage a la creation; retire champs Legal Name/DOB/Nationality/Supervising Officer de la fiche agent
Co-Authored-By: Claude Fable 5 <noreply@anthropic.com>
</commit_message>
<xml_diff>
--- a/templates/personnel-file.docx
+++ b/templates/personnel-file.docx
@@ -137,69 +137,6 @@
           <w:sz w:val="20"/>
           <w:szCs w:val="20"/>
         </w:rPr>
-        <w:t xml:space="preserve">Legal Name:  </w:t>
-      </w:r>
-      <w:r>
-        <w:rPr>
-          <w:sz w:val="20"/>
-          <w:szCs w:val="20"/>
-          <w:color w:val="555555"/>
-        </w:rPr>
-        <w:t xml:space="preserve">________________________</w:t>
-      </w:r>
-    </w:p>
-    <w:p>
-      <w:pPr>
-        <w:spacing w:before="0" w:after="120"/>
-      </w:pPr>
-      <w:r>
-        <w:rPr>
-          <w:b/>
-          <w:sz w:val="20"/>
-          <w:szCs w:val="20"/>
-        </w:rPr>
-        <w:t xml:space="preserve">Date of Birth:  </w:t>
-      </w:r>
-      <w:r>
-        <w:rPr>
-          <w:sz w:val="20"/>
-          <w:szCs w:val="20"/>
-          <w:color w:val="555555"/>
-        </w:rPr>
-        <w:t xml:space="preserve">________________________</w:t>
-      </w:r>
-    </w:p>
-    <w:p>
-      <w:pPr>
-        <w:spacing w:before="0" w:after="120"/>
-      </w:pPr>
-      <w:r>
-        <w:rPr>
-          <w:b/>
-          <w:sz w:val="20"/>
-          <w:szCs w:val="20"/>
-        </w:rPr>
-        <w:t xml:space="preserve">Nationality:  </w:t>
-      </w:r>
-      <w:r>
-        <w:rPr>
-          <w:sz w:val="20"/>
-          <w:szCs w:val="20"/>
-          <w:color w:val="555555"/>
-        </w:rPr>
-        <w:t xml:space="preserve">________________________</w:t>
-      </w:r>
-    </w:p>
-    <w:p>
-      <w:pPr>
-        <w:spacing w:before="0" w:after="120"/>
-      </w:pPr>
-      <w:r>
-        <w:rPr>
-          <w:b/>
-          <w:sz w:val="20"/>
-          <w:szCs w:val="20"/>
-        </w:rPr>
         <w:t xml:space="preserve">Date of Enlistment:  </w:t>
       </w:r>
       <w:r>
@@ -261,27 +198,6 @@
           <w:szCs w:val="20"/>
         </w:rPr>
         <w:t xml:space="preserve">Duty Station:  </w:t>
-      </w:r>
-      <w:r>
-        <w:rPr>
-          <w:sz w:val="20"/>
-          <w:szCs w:val="20"/>
-          <w:color w:val="555555"/>
-        </w:rPr>
-        <w:t xml:space="preserve">________________________</w:t>
-      </w:r>
-    </w:p>
-    <w:p>
-      <w:pPr>
-        <w:spacing w:before="0" w:after="120"/>
-      </w:pPr>
-      <w:r>
-        <w:rPr>
-          <w:b/>
-          <w:sz w:val="20"/>
-          <w:szCs w:val="20"/>
-        </w:rPr>
-        <w:t xml:space="preserve">Supervising Officer:  </w:t>
       </w:r>
       <w:r>
         <w:rPr>

</xml_diff>